<commit_message>
Remove outdated PRD template and text file; add new registration form HTML
</commit_message>
<xml_diff>
--- a/HTML.docx
+++ b/HTML.docx
@@ -720,12 +720,12 @@
     </w:p>
     <w:p>
       <w:pPr>
-        <w:jc w:val="center"/>
+        <w:jc w:val="both"/>
         <w:rPr>
           <w:rFonts w:ascii="Times New Roman" w:hAnsi="Times New Roman" w:cs="Times New Roman"/>
           <w:noProof/>
-          <w:sz w:val="36"/>
-          <w:szCs w:val="36"/>
+          <w:sz w:val="16"/>
+          <w:szCs w:val="16"/>
         </w:rPr>
       </w:pPr>
     </w:p>
@@ -735,14 +735,231 @@
         <w:rPr>
           <w:rFonts w:ascii="Times New Roman" w:hAnsi="Times New Roman" w:cs="Times New Roman"/>
           <w:noProof/>
-          <w:sz w:val="36"/>
-          <w:szCs w:val="36"/>
+          <w:sz w:val="32"/>
+          <w:szCs w:val="32"/>
         </w:rPr>
         <w:sectPr>
           <w:type w:val="continuous"/>
           <w:pgSz w:w="12240" w:h="15840"/>
           <w:pgMar w:top="1440" w:right="1440" w:bottom="1440" w:left="1440" w:header="720" w:footer="720" w:gutter="0"/>
           <w:cols w:num="2" w:space="720"/>
+          <w:docGrid w:linePitch="360"/>
+        </w:sectPr>
+      </w:pPr>
+    </w:p>
+    <w:p>
+      <w:pPr>
+        <w:jc w:val="center"/>
+        <w:rPr>
+          <w:rFonts w:ascii="Times New Roman" w:hAnsi="Times New Roman" w:cs="Times New Roman"/>
+          <w:noProof/>
+          <w:sz w:val="32"/>
+          <w:szCs w:val="32"/>
+        </w:rPr>
+      </w:pPr>
+      <w:r>
+        <w:rPr>
+          <w:rFonts w:ascii="Times New Roman" w:hAnsi="Times New Roman" w:cs="Times New Roman"/>
+          <w:noProof/>
+          <w:sz w:val="32"/>
+          <w:szCs w:val="32"/>
+        </w:rPr>
+        <w:lastRenderedPageBreak/>
+        <w:t>Form designing</w:t>
+      </w:r>
+    </w:p>
+    <w:p>
+      <w:pPr>
+        <w:jc w:val="both"/>
+        <w:rPr>
+          <w:rFonts w:ascii="Times New Roman" w:hAnsi="Times New Roman" w:cs="Times New Roman"/>
+          <w:noProof/>
+          <w:sz w:val="20"/>
+          <w:szCs w:val="20"/>
+        </w:rPr>
+      </w:pPr>
+      <w:r>
+        <w:rPr>
+          <w:rFonts w:ascii="Times New Roman" w:hAnsi="Times New Roman" w:cs="Times New Roman"/>
+          <w:noProof/>
+          <w:sz w:val="20"/>
+          <w:szCs w:val="20"/>
+        </w:rPr>
+        <w:t>maxlength="" ka mtlb hota hai ki hum input mein kitne letter le rhe hai usse jyada nhi le sakte</w:t>
+      </w:r>
+    </w:p>
+    <w:p>
+      <w:pPr>
+        <w:jc w:val="both"/>
+        <w:rPr>
+          <w:rFonts w:ascii="Times New Roman" w:hAnsi="Times New Roman" w:cs="Times New Roman"/>
+          <w:noProof/>
+          <w:sz w:val="20"/>
+          <w:szCs w:val="20"/>
+        </w:rPr>
+      </w:pPr>
+      <w:r>
+        <w:rPr>
+          <w:rFonts w:ascii="Times New Roman" w:hAnsi="Times New Roman" w:cs="Times New Roman"/>
+          <w:noProof/>
+          <w:sz w:val="20"/>
+          <w:szCs w:val="20"/>
+        </w:rPr>
+        <w:t>size="" eska mtlb hota hai ki input section ka size kitna hoga</w:t>
+      </w:r>
+    </w:p>
+    <w:p>
+      <w:pPr>
+        <w:jc w:val="both"/>
+        <w:rPr>
+          <w:rFonts w:ascii="Times New Roman" w:hAnsi="Times New Roman" w:cs="Times New Roman"/>
+          <w:noProof/>
+          <w:sz w:val="20"/>
+          <w:szCs w:val="20"/>
+        </w:rPr>
+      </w:pPr>
+      <w:r>
+        <w:rPr>
+          <w:rFonts w:ascii="Times New Roman" w:hAnsi="Times New Roman" w:cs="Times New Roman"/>
+          <w:noProof/>
+          <w:sz w:val="20"/>
+          <w:szCs w:val="20"/>
+        </w:rPr>
+        <w:t>action- use hota hai jb hum backend se connect krte hai uss time</w:t>
+      </w:r>
+    </w:p>
+    <w:p>
+      <w:pPr>
+        <w:jc w:val="both"/>
+        <w:rPr>
+          <w:rFonts w:ascii="Times New Roman" w:hAnsi="Times New Roman" w:cs="Times New Roman"/>
+          <w:noProof/>
+          <w:sz w:val="20"/>
+          <w:szCs w:val="20"/>
+        </w:rPr>
+      </w:pPr>
+      <w:r>
+        <w:rPr>
+          <w:rFonts w:ascii="Times New Roman" w:hAnsi="Times New Roman" w:cs="Times New Roman"/>
+          <w:noProof/>
+          <w:sz w:val="20"/>
+          <w:szCs w:val="20"/>
+        </w:rPr>
+        <w:t>method- use hota jaise get post ye esiliye krte hai jisse ye browser pr dikhe</w:t>
+      </w:r>
+    </w:p>
+    <w:p>
+      <w:pPr>
+        <w:jc w:val="both"/>
+        <w:rPr>
+          <w:rFonts w:ascii="Times New Roman" w:hAnsi="Times New Roman" w:cs="Times New Roman"/>
+          <w:noProof/>
+          <w:sz w:val="20"/>
+          <w:szCs w:val="20"/>
+        </w:rPr>
+      </w:pPr>
+      <w:r>
+        <w:rPr>
+          <w:rFonts w:ascii="Times New Roman" w:hAnsi="Times New Roman" w:cs="Times New Roman"/>
+          <w:noProof/>
+          <w:sz w:val="20"/>
+          <w:szCs w:val="20"/>
+        </w:rPr>
+        <w:t>name- tb use hota hai jb browser mein get chlta hai</w:t>
+      </w:r>
+    </w:p>
+    <w:p>
+      <w:pPr>
+        <w:rPr>
+          <w:rFonts w:ascii="Times New Roman" w:hAnsi="Times New Roman" w:cs="Times New Roman"/>
+          <w:noProof/>
+          <w:sz w:val="36"/>
+          <w:szCs w:val="36"/>
+        </w:rPr>
+        <w:sectPr>
+          <w:type w:val="continuous"/>
+          <w:pgSz w:w="12240" w:h="15840"/>
+          <w:pgMar w:top="1440" w:right="1440" w:bottom="1440" w:left="1440" w:header="720" w:footer="720" w:gutter="0"/>
+          <w:cols w:space="720"/>
+          <w:docGrid w:linePitch="360"/>
+        </w:sectPr>
+      </w:pPr>
+    </w:p>
+    <w:p>
+      <w:pPr>
+        <w:jc w:val="center"/>
+        <w:rPr>
+          <w:rFonts w:ascii="Times New Roman" w:hAnsi="Times New Roman" w:cs="Times New Roman"/>
+          <w:noProof/>
+          <w:sz w:val="36"/>
+          <w:szCs w:val="36"/>
+        </w:rPr>
+        <w:sectPr>
+          <w:type w:val="continuous"/>
+          <w:pgSz w:w="12240" w:h="15840"/>
+          <w:pgMar w:top="1440" w:right="1440" w:bottom="1440" w:left="1440" w:header="720" w:footer="720" w:gutter="0"/>
+          <w:cols w:space="720"/>
+          <w:docGrid w:linePitch="360"/>
+        </w:sectPr>
+      </w:pPr>
+      <w:r>
+        <w:rPr>
+          <w:rFonts w:ascii="Times New Roman" w:hAnsi="Times New Roman" w:cs="Times New Roman"/>
+          <w:noProof/>
+          <w:sz w:val="36"/>
+          <w:szCs w:val="36"/>
+        </w:rPr>
+        <w:drawing>
+          <wp:inline distT="0" distB="0" distL="0" distR="0" wp14:anchorId="4DD08605" wp14:editId="15A0512E">
+            <wp:extent cx="2341418" cy="2604135"/>
+            <wp:effectExtent l="0" t="0" r="1905" b="5715"/>
+            <wp:docPr id="312517045" name="Picture 1"/>
+            <wp:cNvGraphicFramePr>
+              <a:graphicFrameLocks xmlns:a="http://schemas.openxmlformats.org/drawingml/2006/main" noChangeAspect="1"/>
+            </wp:cNvGraphicFramePr>
+            <a:graphic xmlns:a="http://schemas.openxmlformats.org/drawingml/2006/main">
+              <a:graphicData uri="http://schemas.openxmlformats.org/drawingml/2006/picture">
+                <pic:pic xmlns:pic="http://schemas.openxmlformats.org/drawingml/2006/picture">
+                  <pic:nvPicPr>
+                    <pic:cNvPr id="312517045" name=""/>
+                    <pic:cNvPicPr/>
+                  </pic:nvPicPr>
+                  <pic:blipFill>
+                    <a:blip r:embed="rId16"/>
+                    <a:stretch>
+                      <a:fillRect/>
+                    </a:stretch>
+                  </pic:blipFill>
+                  <pic:spPr>
+                    <a:xfrm>
+                      <a:off x="0" y="0"/>
+                      <a:ext cx="2346405" cy="2609682"/>
+                    </a:xfrm>
+                    <a:prstGeom prst="rect">
+                      <a:avLst/>
+                    </a:prstGeom>
+                  </pic:spPr>
+                </pic:pic>
+              </a:graphicData>
+            </a:graphic>
+          </wp:inline>
+        </w:drawing>
+      </w:r>
+    </w:p>
+    <w:p>
+      <w:pPr>
+        <w:jc w:val="center"/>
+        <w:rPr>
+          <w:rFonts w:ascii="Times New Roman" w:hAnsi="Times New Roman" w:cs="Times New Roman"/>
+          <w:noProof/>
+          <w:sz w:val="36"/>
+          <w:szCs w:val="36"/>
+        </w:rPr>
+        <w:sectPr>
+          <w:type w:val="continuous"/>
+          <w:pgSz w:w="12240" w:h="15840"/>
+          <w:pgMar w:top="1440" w:right="1440" w:bottom="1440" w:left="1440" w:header="720" w:footer="720" w:gutter="0"/>
+          <w:cols w:space="720"/>
           <w:docGrid w:linePitch="360"/>
         </w:sectPr>
       </w:pPr>

</xml_diff>